<commit_message>
docs: fully update coder Tech Spec (.md and .docx) with Maison Art 2-screen architecture, haptics, Kinescope 16:9, and 100% fallback standard
</commit_message>
<xml_diff>
--- a/baza/исходник миникурса/ТЗ_ДЛЯ_КОДЕРА_NOTIBOT_WEBAPP.docx
+++ b/baza/исходник миникурса/ТЗ_ДЛЯ_КОДЕРА_NOTIBOT_WEBAPP.docx
@@ -14,7 +14,7 @@
           <w:color w:val="1F4E5B"/>
           <w:sz w:val="34"/>
         </w:rPr>
-        <w:t>ТЕХНИЧЕСКОЕ ЗАДАНИЕ ДЛЯ ВЕРСТКИ И СБОРКИ В NOTIBOT</w:t>
+        <w:t>ТЕХНИЧЕСКОЕ ЗАДАНИЕ И ЭТАЛОННЫЙ СТАНДАРТ ДИЗАЙНА И АРХИТЕКТУРЫ</w:t>
       </w:r>
     </w:p>
     <w:p>
@@ -29,9 +29,9 @@
           <w:color w:val="555555"/>
           <w:sz w:val="21"/>
         </w:rPr>
-        <w:t>Архитектура воронок, экранов, плееров, динамических цен (2400/5000) и личного кабинета</w:t>
+        <w:t>Стандарт Maison Art (Эталон Сценария 1 ➔ Перенос на Сценарии 2, 3, 4)</w:t>
         <w:br/>
-        <w:t>Проект: Мини-курсы Анатолия Фёдорова</w:t>
+        <w:t>Проект: Мини-курсы и Визитка Анатолия Фёдорова</w:t>
       </w:r>
     </w:p>
     <w:p>
@@ -45,7 +45,21 @@
           <w:color w:val="1F4E5B"/>
           <w:sz w:val="26"/>
         </w:rPr>
-        <w:t>1. СТРУКТУРА И ЭКРАНЫ WEBAPP / NOTIBOT</w:t>
+        <w:t>1. ФУНДАМЕНТАЛЬНЫЙ СТАНДАРТ ДИЗАЙНА И АРХИТЕКТУРЫ (MAISON ART)</w:t>
+      </w:r>
+    </w:p>
+    <w:p>
+      <w:pPr>
+        <w:spacing w:before="160" w:after="40"/>
+      </w:pPr>
+      <w:r>
+        <w:rPr>
+          <w:rFonts w:ascii="Calibri" w:hAnsi="Calibri"/>
+          <w:b/>
+          <w:color w:val="0E6E5D"/>
+          <w:sz w:val="23"/>
+        </w:rPr>
+        <w:t>1.1. Двухэкранная архитектура каждого урока (Virtual Screens)</w:t>
       </w:r>
     </w:p>
     <w:p>
@@ -58,17 +72,276 @@
           <w:i w:val="0"/>
           <w:sz w:val="20"/>
         </w:rPr>
-        <w:t>• Экран 1: Главная визитка-хаб (Баннер, буллеты, кнопка Псиквеста, сетка 2х2 карточек услуг, каналы, кейсы, вход в кабинет, подвал с юридическими ссылками).</w:t>
+        <w:t>В уроке никогда не вываливается всё на одну длинную страницу. Экран урока строго делится на 2 виртуальных экрана без перезагрузки страницы:</w:t>
+      </w:r>
+    </w:p>
+    <w:p>
+      <w:pPr>
+        <w:spacing w:after="80" w:line="276" w:lineRule="auto"/>
+      </w:pPr>
+      <w:r>
+        <w:rPr>
+          <w:rFonts w:ascii="Calibri" w:hAnsi="Calibri"/>
+          <w:b/>
+          <w:sz w:val="20"/>
+        </w:rPr>
+        <w:t xml:space="preserve">• Экран 1 (Видеоурок + Инсайт): </w:t>
+      </w:r>
+      <w:r>
+        <w:rPr>
+          <w:rFonts w:ascii="Calibri" w:hAnsi="Calibri"/>
+          <w:i w:val="0"/>
+          <w:sz w:val="20"/>
+        </w:rPr>
+        <w:t>1. Верхний навигационный Header Bar.</w:t>
         <w:br/>
-        <w:t>• Экран 2: Экспресс-диагностика (Псиквест: 2-минутный интерактивный опрос с ветвлением на 4 сценария).</w:t>
+        <w:t>2. Видеоплеер 16:9 (Kinescope) с авто-паузой.</w:t>
         <w:br/>
-        <w:t>• Экран 3: Результат диагностики + Экран Урока 0 (Видеоплеер Урока 0 + Аудиоплеер экстренной медитации 8 мин + Оффер 2 400 ₽ со спецценой + Кнопка «Пройти Урок 1 бесплатно»).</w:t>
+        <w:t>3. Карточка «Ключевой инсайт» с 2–3 тезисами.</w:t>
         <w:br/>
-        <w:t>• Экран 4: Урок 1 (Бесплатный тест-драйв: Видеоплеер Урока 1 + Таймер дыхания 4-6-2 + Памятка по сну + Блок закрытого доступа к Урокам 2–5 за 5 000 ₽).</w:t>
+        <w:t>4. Кнопка-триггер: «Перейти к практикуму ➔» (скрывает экран 1, останавливает видео pauseVideo(), открывает экран 2 со скроллом наверх).</w:t>
         <w:br/>
-        <w:t>• Экраны 5–8: Закрытые Уроки 2, 3, 4, 5 (Доступны только после оплаты: видеоплееры, аудиоплееры медитаций, интерактивные тренажеры, скачиваемые памятки).</w:t>
+        <w:t>5. Второстепенная кнопка: «Пропустить практикум и перейти к следующему уроку →».</w:t>
+      </w:r>
+    </w:p>
+    <w:p>
+      <w:pPr>
+        <w:spacing w:after="80" w:line="276" w:lineRule="auto"/>
+      </w:pPr>
+      <w:r>
+        <w:rPr>
+          <w:rFonts w:ascii="Calibri" w:hAnsi="Calibri"/>
+          <w:b/>
+          <w:sz w:val="20"/>
+        </w:rPr>
+        <w:t xml:space="preserve">• Экран 2 (Интерактивный практикум): </w:t>
+      </w:r>
+      <w:r>
+        <w:rPr>
+          <w:rFonts w:ascii="Calibri" w:hAnsi="Calibri"/>
+          <w:i w:val="0"/>
+          <w:sz w:val="20"/>
+        </w:rPr>
+        <w:t>1. Кнопка возврата: «← Назад к видеоуроку».</w:t>
         <w:br/>
-        <w:t>• Экран 9: Личный кабинет покупателя (Кабинет с бессрочным доступом к оплаченным курсам, аудиопрактикам и 4 бонусам).</w:t>
+        <w:t>2. Счётчик попыток ИИ (3 попытки) / бейдж инструмента.</w:t>
+        <w:br/>
+        <w:t>3. Поля ввода (слайдеры 0–10, выбор чипов, textarea со счётчиком и автосохранением в localStorage).</w:t>
+        <w:br/>
+        <w:t>4. Кнопка отправки на анализ ИИ.</w:t>
+        <w:br/>
+        <w:t>5. Карточка результата с акцентной рамкой, кнопкой копирования и переходом к следующему уроку.</w:t>
+      </w:r>
+    </w:p>
+    <w:p>
+      <w:pPr>
+        <w:spacing w:before="160" w:after="40"/>
+      </w:pPr>
+      <w:r>
+        <w:rPr>
+          <w:rFonts w:ascii="Calibri" w:hAnsi="Calibri"/>
+          <w:b/>
+          <w:color w:val="0E6E5D"/>
+          <w:sz w:val="23"/>
+        </w:rPr>
+        <w:t>1.2. Навигация: Header Bar + Bottom Drawer (Шторка)</w:t>
+      </w:r>
+    </w:p>
+    <w:p>
+      <w:pPr>
+        <w:spacing w:after="80" w:line="276" w:lineRule="auto"/>
+      </w:pPr>
+      <w:r>
+        <w:rPr>
+          <w:rFonts w:ascii="Calibri" w:hAnsi="Calibri"/>
+          <w:i w:val="0"/>
+          <w:sz w:val="20"/>
+        </w:rPr>
+        <w:t>• Header Bar (.header-bar-nav): Кнопка слева «Навигация по курсу» (открывает Drawer) + кнопка справа «Следующий урок →» + визуальный прогресс-бар (20%...100%).</w:t>
+        <w:br/>
+        <w:t>• Bottom Drawer (выезжающее меню): Список всех 5 уроков + Бонусы, подсветка плашкой «Вы здесь», виброотклик safeHaptic('selection'), свайп-ручка и блокировка скролла body.drawer-open.</w:t>
+      </w:r>
+    </w:p>
+    <w:p>
+      <w:pPr>
+        <w:spacing w:before="160" w:after="40"/>
+      </w:pPr>
+      <w:r>
+        <w:rPr>
+          <w:rFonts w:ascii="Calibri" w:hAnsi="Calibri"/>
+          <w:b/>
+          <w:color w:val="0E6E5D"/>
+          <w:sz w:val="23"/>
+        </w:rPr>
+        <w:t>1.3. Видеоплееры (Kinescope 16:9)</w:t>
+      </w:r>
+    </w:p>
+    <w:p>
+      <w:pPr>
+        <w:spacing w:after="80" w:line="276" w:lineRule="auto"/>
+      </w:pPr>
+      <w:r>
+        <w:rPr>
+          <w:rFonts w:ascii="Calibri" w:hAnsi="Calibri"/>
+          <w:i w:val="0"/>
+          <w:sz w:val="20"/>
+        </w:rPr>
+        <w:t>• Контейнер aspect-ratio: 16 / 9 со скруглением border-radius: 18px и глубокой тенью (никаких сплющиваний).</w:t>
+        <w:br/>
+        <w:t>• Функция pauseVideo(): при любом переходе к практикуму, открытии шторки или переходе на другой экран воспроизведение видео и аудио мгновенно глушится.</w:t>
+      </w:r>
+    </w:p>
+    <w:p>
+      <w:pPr>
+        <w:spacing w:before="160" w:after="40"/>
+      </w:pPr>
+      <w:r>
+        <w:rPr>
+          <w:rFonts w:ascii="Calibri" w:hAnsi="Calibri"/>
+          <w:b/>
+          <w:color w:val="0E6E5D"/>
+          <w:sz w:val="23"/>
+        </w:rPr>
+        <w:t>1.4. Хаб бонусов: Сетка 2×2 с фото-оверлеем</w:t>
+      </w:r>
+    </w:p>
+    <w:p>
+      <w:pPr>
+        <w:spacing w:after="80" w:line="276" w:lineRule="auto"/>
+      </w:pPr>
+      <w:r>
+        <w:rPr>
+          <w:rFonts w:ascii="Calibri" w:hAnsi="Calibri"/>
+          <w:i w:val="0"/>
+          <w:sz w:val="20"/>
+        </w:rPr>
+        <w:t>• Бонусы упакованы в сетку 2 ряда × 2 колонки (.bonuses-grid).</w:t>
+        <w:br/>
+        <w:t>• Карточка бонуса: квадратный формат (1:1), фоновое фото + градиентное затемнение, четкий контрастный заголовок с тенью, микроанимация подъема и виброотклик.</w:t>
+      </w:r>
+    </w:p>
+    <w:p>
+      <w:pPr>
+        <w:spacing w:before="160" w:after="40"/>
+      </w:pPr>
+      <w:r>
+        <w:rPr>
+          <w:rFonts w:ascii="Calibri" w:hAnsi="Calibri"/>
+          <w:b/>
+          <w:color w:val="0E6E5D"/>
+          <w:sz w:val="23"/>
+        </w:rPr>
+        <w:t>1.5. Работа с ИИ и 100% Fallback-система</w:t>
+      </w:r>
+    </w:p>
+    <w:p>
+      <w:pPr>
+        <w:spacing w:after="80" w:line="276" w:lineRule="auto"/>
+      </w:pPr>
+      <w:r>
+        <w:rPr>
+          <w:rFonts w:ascii="Calibri" w:hAnsi="Calibri"/>
+          <w:i w:val="0"/>
+          <w:sz w:val="20"/>
+        </w:rPr>
+        <w:t>• 3 попытки на каждый интерактивный практикум.</w:t>
+        <w:br/>
+        <w:t>• 100% Fallback: при сбое сети или тайм-ауте интерфейс никогда не показывает ошибку, а через 1.5 сек выдает готовый глубокий клинический разбор (mock data).</w:t>
+        <w:br/>
+        <w:t>• Локальное сохранение всех введенных текстов в localStorage.</w:t>
+      </w:r>
+    </w:p>
+    <w:p>
+      <w:pPr>
+        <w:spacing w:before="160" w:after="40"/>
+      </w:pPr>
+      <w:r>
+        <w:rPr>
+          <w:rFonts w:ascii="Calibri" w:hAnsi="Calibri"/>
+          <w:b/>
+          <w:color w:val="0E6E5D"/>
+          <w:sz w:val="23"/>
+        </w:rPr>
+        <w:t>1.6. High-Ticket Оффер (10 000 ₽)</w:t>
+      </w:r>
+    </w:p>
+    <w:p>
+      <w:pPr>
+        <w:spacing w:after="80" w:line="276" w:lineRule="auto"/>
+      </w:pPr>
+      <w:r>
+        <w:rPr>
+          <w:rFonts w:ascii="Calibri" w:hAnsi="Calibri"/>
+          <w:i w:val="0"/>
+          <w:sz w:val="20"/>
+        </w:rPr>
+        <w:t>В конце 5-го урока и в бонусах размещается премиальная карточка с бейджем «Индивидуальная работа», описанием разбора 1-на-1 (60–80 мин) + 10+ страниц портрета и пульсирующей кнопкой «Записаться на разбор за 10 000 ₽ →» (вызов openProduct('course_partner_10000')).</w:t>
+      </w:r>
+    </w:p>
+    <w:p>
+      <w:pPr>
+        <w:spacing w:before="160" w:after="40"/>
+      </w:pPr>
+      <w:r>
+        <w:rPr>
+          <w:rFonts w:ascii="Calibri" w:hAnsi="Calibri"/>
+          <w:b/>
+          <w:color w:val="0E6E5D"/>
+          <w:sz w:val="23"/>
+        </w:rPr>
+        <w:t>1.7. Дизайн-токены и Цветовая палитра (Maison Art)</w:t>
+      </w:r>
+    </w:p>
+    <w:p>
+      <w:pPr>
+        <w:spacing w:after="80" w:line="276" w:lineRule="auto"/>
+      </w:pPr>
+      <w:r>
+        <w:rPr>
+          <w:rFonts w:ascii="Calibri" w:hAnsi="Calibri"/>
+          <w:i w:val="0"/>
+          <w:sz w:val="20"/>
+        </w:rPr>
+        <w:t>• Фон: стеклянный градиент с динамическими плавающими арт-формами (#maisonArtBackground).</w:t>
+        <w:br/>
+        <w:t>• Текст/Заголовки: глубокий темный #1F2E35 / #243139.</w:t>
+        <w:br/>
+        <w:t>• Основной акцент: морская волна / хвоя #2D5A60 / #4A7C7D.</w:t>
+        <w:br/>
+        <w:t>• Теплый акцент (кнопки): linear-gradient(105deg, #B5663E 0%, #BD7249 50%, #CB8760 100%).</w:t>
+        <w:br/>
+        <w:t>• Стекло (Glass card): rgba(255, 255, 255, 0.88) с backdrop-filter: blur(16px) и белой окантовкой.</w:t>
+      </w:r>
+    </w:p>
+    <w:p>
+      <w:pPr>
+        <w:spacing w:before="160" w:after="40"/>
+      </w:pPr>
+      <w:r>
+        <w:rPr>
+          <w:rFonts w:ascii="Calibri" w:hAnsi="Calibri"/>
+          <w:b/>
+          <w:color w:val="0E6E5D"/>
+          <w:sz w:val="23"/>
+        </w:rPr>
+        <w:t>1.8. Мобильная эргономика (Mobile-First)</w:t>
+      </w:r>
+    </w:p>
+    <w:p>
+      <w:pPr>
+        <w:spacing w:after="80" w:line="276" w:lineRule="auto"/>
+      </w:pPr>
+      <w:r>
+        <w:rPr>
+          <w:rFonts w:ascii="Calibri" w:hAnsi="Calibri"/>
+          <w:i w:val="0"/>
+          <w:sz w:val="20"/>
+        </w:rPr>
+        <w:t>• Haptic Feedback: вибрация при кликах через safeHaptic('selection' | 'impact' | 'success').</w:t>
+        <w:br/>
+        <w:t>• Safe Area: учет env(safe-area-inset-top) и env(safe-area-inset-bottom).</w:t>
+        <w:br/>
+        <w:t>• Полная изоляция горизонтального скролла.</w:t>
       </w:r>
     </w:p>
     <w:p>
@@ -82,7 +355,7 @@
           <w:color w:val="1F4E5B"/>
           <w:sz w:val="26"/>
         </w:rPr>
-        <w:t>2. ЛОГИКА ДИНАМИЧЕСКИХ ЦЕН И ОПЛАТЫ</w:t>
+        <w:t>2. КАРТА ПУТИ И ДИНАМИЧЕСКИЕ ЦЕНЫ (ROBOKASSA)</w:t>
       </w:r>
     </w:p>
     <w:p>
@@ -95,11 +368,11 @@
           <w:i w:val="0"/>
           <w:sz w:val="20"/>
         </w:rPr>
-        <w:t>1. На Экране Урока 0: Кнопка «Купить за 2 400 ₽» (передает в Robokassa сумму 2 400 ₽). Таймер обратного отсчета на 60 минут. При нажатии «Пройти Урок 1 бесплатно» — пользователь переходит на Экран Урока 1.</w:t>
+        <w:t>• На Экране 3 (Урок 0): Кнопка «Купить за 2 400 ₽» (таймер 60 мин) + кнопка «Пройти Урок 1 бесплатно».</w:t>
         <w:br/>
-        <w:t>2. На Экране Урока 1: Кнопка оплаты «Купить за 5 000 ₽» (передает в Robokassa сумму 5 000 ₽). Скидка 2 400 ₽ блокируется.</w:t>
+        <w:t>• На Экране 4 (Урок 1): Спеццена сгорает, кнопка «Оплатить полный доступ за 5 000 ₽».</w:t>
         <w:br/>
-        <w:t>3. После успешного Webhook от Robokassa: пользователю автоматически присваивается тег `paid_scenario_X`, открываются экраны Уроков 2–5 и выдается доступ в Личный кабинет.</w:t>
+        <w:t>• После вебхука Robokassa: присвоение тега paid_scenario_X, открытие закрытых Уроков 2–5 и Личного кабинета.</w:t>
       </w:r>
     </w:p>
     <w:p>
@@ -113,7 +386,7 @@
           <w:color w:val="1F4E5B"/>
           <w:sz w:val="26"/>
         </w:rPr>
-        <w:t>3. ТРЕБОВАНИЯ К ПЛЕЕРАМ И ИНТЕРАКТИВАМ</w:t>
+        <w:t>3. ОБЯЗАТЕЛЬНЫЙ ЧЕК-ЛИСТ ДЛЯ СБОРКИ КАЖДОГО НОВОГО ЭКРАНА</w:t>
       </w:r>
     </w:p>
     <w:p>
@@ -126,46 +399,17 @@
           <w:i w:val="0"/>
           <w:sz w:val="20"/>
         </w:rPr>
-        <w:t>• Видеоплеер: Кастомный HTML5 плеер с поддержкой вертикального и горизонтального видео, запрет на скачивание (disable context menu), автосохранение прогресса просмотра.</w:t>
+        <w:t>1. Номер урока и сценарий (например: Сценарий 4, Урок 2).</w:t>
         <w:br/>
-        <w:t>• Аудиоплеер медитаций: Стильный темный плеер (зеленый изумруд #0E3B43), бегунок таймлайна, кнопка фонового воспроизведения при свернутом экране.</w:t>
+        <w:t>2. Kinescope Video ID (ссылка на плеер 16:9).</w:t>
         <w:br/>
-        <w:t>• Тренажер дыхания: Анимированный круг расширения/сжатия (4 сек вдох — 6 сек выдох — 2 сек пауза).</w:t>
+        <w:t>3. Тезисы карточки «Ключевой инсайт» (2–3 пункта под видео).</w:t>
         <w:br/>
-        <w:t>• Юридический подвал: Ссылки на модальные окна / внешние файлы: Оферта, Политика ПД, Согласие на обработку, Прайс-лист.</w:t>
-      </w:r>
-    </w:p>
-    <w:p>
-      <w:pPr>
-        <w:spacing w:before="280" w:after="60"/>
-      </w:pPr>
-      <w:r>
-        <w:rPr>
-          <w:rFonts w:ascii="Calibri" w:hAnsi="Calibri"/>
-          <w:b/>
-          <w:color w:val="1F4E5B"/>
-          <w:sz w:val="26"/>
-        </w:rPr>
-        <w:t>4. АВТОМАТИЧЕСКИЕ ЦЕПОЧКИ РАССЫЛОК</w:t>
-      </w:r>
-    </w:p>
-    <w:p>
-      <w:pPr>
-        <w:spacing w:after="80" w:line="276" w:lineRule="auto"/>
-      </w:pPr>
-      <w:r>
-        <w:rPr>
-          <w:rFonts w:ascii="Calibri" w:hAnsi="Calibri"/>
-          <w:i w:val="0"/>
-          <w:sz w:val="20"/>
-        </w:rPr>
-        <w:t>Настроить триггеры в NotiBot согласно файлу «ЦЕПОЧКИ_СООБЩЕНИЙ_ДЛЯ_ВСЕХ_4_СЦЕНАРИЕВ.docx»:</w:t>
+        <w:t>4. Поля интерактивной практики (слайдеры, чипы, textarea, аудио).</w:t>
         <w:br/>
-        <w:t>— Цепочка дожима (через 2ч, 24ч, 48ч после теста для неоплативших);</w:t>
+        <w:t>5. Системный промпт для ИИ + готовый Fallback-ответ.</w:t>
         <w:br/>
-        <w:t>— Цепочка доходимости (после открытия каждого урока + пинг через 48ч неактивности);</w:t>
-        <w:br/>
-        <w:t>— Все кнопки «Написать Анатолию» ведут по ссылке `https://t.me/luck_master`.</w:t>
+        <w:t>6. Notibot Article ID для бесшовных переходов.</w:t>
       </w:r>
     </w:p>
     <w:sectPr>

</xml_diff>